<commit_message>
kalman filter & face recovery
</commit_message>
<xml_diff>
--- a/ProjectReport.docx
+++ b/ProjectReport.docx
@@ -42,23 +42,7 @@
         <w:t>s</w:t>
       </w:r>
       <w:r>
-        <w:t xml:space="preserve"> against. It uses open </w:t>
-      </w:r>
-      <w:proofErr w:type="spellStart"/>
-      <w:r>
-        <w:t>cv’s</w:t>
-      </w:r>
-      <w:proofErr w:type="spellEnd"/>
-      <w:r>
-        <w:t xml:space="preserve"> </w:t>
-      </w:r>
-      <w:proofErr w:type="spellStart"/>
-      <w:r>
-        <w:t>haar</w:t>
-      </w:r>
-      <w:proofErr w:type="spellEnd"/>
-      <w:r>
-        <w:t xml:space="preserve"> cascade which is not a neural network</w:t>
+        <w:t xml:space="preserve"> against. It uses open cv’s haar cascade which is not a neural network</w:t>
       </w:r>
       <w:r>
         <w:t xml:space="preserve"> but instead scans for light/dark patterns. Each frame is cut in half from 640x480 to 320x240 for speed and converted to gray scale.</w:t>
@@ -78,7 +62,13 @@
         <w:ind w:firstLine="720"/>
       </w:pPr>
       <w:r>
-        <w:t>Both robots now run a working baseline and log the same per-frame measurements: detection time, the detected face and its score, and where the servos were pointing. Every frame is logged on both robots. For this checkpoint we compare the best Raspberry Pi recording (7.9 s, 281 frames) with the latest ESP32-S3 recording (11.7 s, 208 frames). Both were analysed with the same script and the same definitions.</w:t>
+        <w:t>Both robots now run a working baseline and log the same per-frame measurements: detection time, the detected face and its score, and where the servos were pointing. Every frame is logged on both robots. For this checkpoint we compare the Raspberry Pi (7.9 s, 281 frames) with the latest ESP32-S3 (11.7 s, 208 frames). Both were analy</w:t>
+      </w:r>
+      <w:r>
+        <w:t>z</w:t>
+      </w:r>
+      <w:r>
+        <w:t>ed with the same script and the same definitions.</w:t>
       </w:r>
     </w:p>
     <w:p>
@@ -92,7 +82,13 @@
         <w:t xml:space="preserve">The Raspberry Pi as the reference point. </w:t>
       </w:r>
       <w:r>
-        <w:t>The Raspberry Pi is the reference the microcontroller is measured against. It has a quad-core processor running at well over a gigahertz and gigabytes of memory, against the ESP32-S3's two 240 MHz cores and 512 KB of on-chip RAM. It also has a full operating system, network access and standard libraries, which make development, debugging and data collection much easier. These advantages are why it runs twice as many frames per second and reacts faster. The question this project asks is how close a few-dollar microcontroller can get to that reference, and the gap between the two is what future models aim to close.</w:t>
+        <w:t xml:space="preserve">The Raspberry Pi is the reference the microcontroller is measured against. It has a quad-core processor running at well over a gigahertz and gigabytes of memory, against the ESP32-S3's two 240 MHz cores and 512 KB of on-chip RAM. It also has a full operating system, network access and standard libraries, which make development, debugging and data collection much easier. These advantages are why it runs twice as many frames per second and reacts faster. The question this project asks is how close a </w:t>
+      </w:r>
+      <w:r>
+        <w:t xml:space="preserve">very limited </w:t>
+      </w:r>
+      <w:r>
+        <w:t>microcontroller can get to that reference, and the gap between the two is what future models aim to close.</w:t>
       </w:r>
     </w:p>
     <w:p>
@@ -106,7 +102,7 @@
         <w:t xml:space="preserve">Raspberry Pi with a Haar cascade. </w:t>
       </w:r>
       <w:r>
-        <w:t>The Pi was fast and stable. Detection took 15.6 ms per frame at the median and 24.4 ms at the 99th percentile, and the loop ran at about 36 frames per second. With a face held steady toward the camera it detected the face in 99 % of frames, lost it only three times for a single frame each, and kept the face centre within the central quarter of the image in 95 % of tracked frames.</w:t>
+        <w:t xml:space="preserve">The Pi was fast and stable. Detection took 15.6 ms per frame at the median and 24.4 ms at the 99th percentile, and the loop ran at about 36 frames per second. With a face held steady toward the camera it detected the face in 99 % of frames, lost it only three times for a single frame each, and kept the face centre within the central quarter of the image in 95 % of tracked frames. The video shows how much this depends on the face looking at the camera: in this clip the face stays mostly still and frontal, and the Pi's detection drops out as soon as the face turns away. </w:t>
       </w:r>
     </w:p>
     <w:p>
@@ -117,14 +113,11 @@
         <w:rPr>
           <w:b/>
         </w:rPr>
+        <w:lastRenderedPageBreak/>
         <w:t xml:space="preserve">ESP32-S3 with Espressif's ESP-DL detector. </w:t>
       </w:r>
       <w:r>
-        <w:t xml:space="preserve">The ESP32-S3 runs Espressif's two-stage face detection network (MSR+MNP), quantized to 8-bit integers and about 190 KB in size. Detection took 45.3 ms per frame at the median and 49.3 ms at the 99th percentile, </w:t>
-      </w:r>
-      <w:r>
-        <w:lastRenderedPageBreak/>
-        <w:t>and the loop ran at about 18 frames per second. The robot tracked for the whole recording while the subject moved, across a pan range of 61–102°. It detected the face in 93 % of frames. It missed the face 13 times, but every miss lasted less than 0.2 s, so the tracker never had to stop and wait. At least 189 KB of on-chip RAM remained free throughout.</w:t>
+        <w:t xml:space="preserve">The ESP32-S3 runs Espressif's two-stage face detection network (MSR+MNP), quantized to 8-bit integers and about 190 KB in size. Detection took 45.3 ms per frame at the median and 49.3 ms at the 99th percentile, and the loop ran at about 18 frames per second. The robot tracked for the whole recording while the subject moved, across a pan range of 61–102°. It detected the face in 93 % of frames. It missed the face 13 times, but every miss lasted less than 0.2 s, so the tracker never had to stop and wait. At least 189 KB of on-chip RAM remained free throughout. The ESP32-S3 video contains much more movement of the face than the Pi's, side to side and up and down, and the box stays on the face throughout. </w:t>
       </w:r>
     </w:p>
     <w:p>
@@ -713,11 +706,11 @@
         <w:t xml:space="preserve">Movement needed to keep the face centred. </w:t>
       </w:r>
       <w:r>
-        <w:t xml:space="preserve">To compare how hard each robot had to work, we measured how fast the mount itself moved (the change in pan and tilt over the previous 0.3 s). The ESP32-S3 recording was the more demanding one. At a typical moment its mount turned at 26 °/s against the Pi's 18 °/s, and its pan moved 24° every second against 14°. In its fast moments it reached 73 °/s and spent 33 % of the time above 35 °/s, while the Pi's best clip never exceeded 46 °/s and spent only 1 % of the time above 35 °/s. Both tilts moved about 13–14 °/s, but the Pi's stayed within a narrow 8° range, which shows </w:t>
+        <w:t xml:space="preserve">To compare how hard each robot had to work, we measured how fast the mount itself moved (the change in pan and tilt over the previous 0.3 s). The ESP32-S3 recording was the more demanding one. At a typical moment </w:t>
       </w:r>
       <w:r>
         <w:lastRenderedPageBreak/>
-        <w:t>its controller making small corrections every frame, while the ESP32-S3's covered 16° following the subject.</w:t>
+        <w:t xml:space="preserve">its mount turned at 26 °/s against the Pi's 18 °/s, and its pan moved 24° every second against 14°. In its fast moments it reached 73 °/s and spent 33 % of the time above 35 °/s, while the Pi's best clip never exceeded 46 °/s and spent only 1 % of the time above 35 °/s. Both tilts moved about 13–14 °/s, but the Pi's stayed within a narrow 8° range, which shows its controller making small corrections every frame, while the ESP32-S3's covered 16° following the subject. The videos make the same point: the face moves far more in the ESP32-S3 recording than in the Pi's. </w:t>
       </w:r>
     </w:p>
     <w:p>
@@ -1073,17 +1066,17 @@
         <w:t xml:space="preserve"> </w:t>
       </w:r>
       <w:r>
-        <w:t>less steady recording</w:t>
+        <w:t xml:space="preserve">less </w:t>
+      </w:r>
+      <w:r>
+        <w:lastRenderedPageBreak/>
+        <w:t>steady recording</w:t>
       </w:r>
       <w:r>
         <w:t>s the RPi’s</w:t>
       </w:r>
       <w:r>
-        <w:t xml:space="preserve"> detection rate fell to 60 %. The ESP32-S3 is about three times slower and misses more single frames, but it detected the face in 93 % of frames and never lost it for more than 0.2 s, on a recording with considerably faster movement than the Pi's. It does this with a quantized network of about 190 KB on a microcontroller with a small fraction of the Pi's memory and power, and its timing is very consistent because nothing </w:t>
-      </w:r>
-      <w:r>
-        <w:lastRenderedPageBreak/>
-        <w:t>else runs on the chip. The ESP32-S3 baseline is therefore a credible starting point for the rest of the project, and its main constraints are frame rate and the 160×120 resolution of its first stage.</w:t>
+        <w:t xml:space="preserve"> detection rate fell to 60 %. The ESP32-S3 is about three times slower and misses more single frames, but it detected the face in 93 % of frames and never lost it for more than 0.2 s, on a recording with considerably faster movement than the Pi's. It does this with a quantized network of about 190 KB on a microcontroller with a small fraction of the Pi's memory and power, and its timing is very consistent because nothing else runs on the chip. The ESP32-S3 baseline is therefore a credible starting point for the rest of the project, and its main constraints are frame rate and the 160×120 resolution of its first stage. The videos make this difference clear: the Pi's detection drops as soon as the face turns away, while the ESP32-S3 kept detecting a face that moved far more. </w:t>
       </w:r>
     </w:p>
     <w:p>
@@ -1189,11 +1182,11 @@
         <w:ind w:firstLine="720"/>
       </w:pPr>
       <w:r>
-        <w:t xml:space="preserve">Both robots are built, both run a working face detection baseline, and both are measured with the same metrics. The Raspberry Pi with a classical Haar cascade is the reference point. Its far greater processing power gives it twice the frame rate (about 16 ms per frame, 36 frames per second), and on its best recording it detected and centred a steady frontal face almost perfectly; it is also much easier to develop on. Its weakness is that it only recognises frontal faces. The ESP32-S3 running Espressif's quantized neural network is about three times slower (45 ms, 18 frames per second), yet it detected a moving person in 93 % of frames with about 190 KB of model weights, and kept finding the face even at high mount speeds. Its main limitation is speed, which shows up as poorer centring during fast movement. Most of the work so far went into making the robots </w:t>
+        <w:t xml:space="preserve">Both robots are built, both run a working face detection baseline, and both are measured with the same metrics. The Raspberry Pi with a classical Haar cascade is the reference point. Its far greater processing power gives it twice the frame rate (about 16 ms per frame, 36 frames per second), and on its best recording it detected and centred a </w:t>
       </w:r>
       <w:r>
         <w:lastRenderedPageBreak/>
-        <w:t>reliable: power, connectivity, the build toolchain, servo direction, and a scan and hold strategy that suits the detector. With those fixed and the tracking controller frozen, the project now has a fair reference point on each platform for the models that follow.</w:t>
+        <w:t xml:space="preserve">steady frontal face almost perfectly; it is also much easier to develop on. Its weakness is that it only recognises frontal faces. The ESP32-S3 running Espressif's quantized neural network is about three times slower (45 ms, 18 frames per second), yet it detected a moving person in 93 % of frames with about 190 KB of model weights, and kept finding the face even at high mount speeds. Its main limitation is speed, which shows up as poorer centring during fast movement. Most of the work so far went into making the robots reliable: power, connectivity, the build toolchain, servo direction, and a scan and hold strategy that suits the detector. With those fixed and the tracking controller frozen, the project now has a fair reference point on each platform for the models that follow. In the recorded videos, the Pi's detection drops as soon as the face turns away, while the ESP32-S3 keeps following a face that moves much more. </w:t>
       </w:r>
     </w:p>
     <w:p/>
@@ -1260,6 +1253,7 @@
         <w:rPr>
           <w:b/>
         </w:rPr>
+        <w:lastRenderedPageBreak/>
         <w:t xml:space="preserve">Further models to compare against the baselines. </w:t>
       </w:r>
       <w:r>
@@ -1274,11 +1268,22 @@
         <w:rPr>
           <w:b/>
         </w:rPr>
-        <w:lastRenderedPageBreak/>
         <w:t xml:space="preserve">Methods to test on those models. </w:t>
       </w:r>
       <w:r>
-        <w:t xml:space="preserve">For each model we will compare post-training quantization with quantization-aware training, per-channel with per-tensor scales, and input resolutions of 160×120, 224×168 and 320×240. </w:t>
+        <w:t>For each model we will compare post-training quantization with quantization-aware training, per-channel with per-tensor scales, and</w:t>
+      </w:r>
+      <w:r>
+        <w:t xml:space="preserve"> v</w:t>
+      </w:r>
+      <w:r>
+        <w:t>a</w:t>
+      </w:r>
+      <w:r>
+        <w:t>rying</w:t>
+      </w:r>
+      <w:r>
+        <w:t xml:space="preserve"> input resolutions. </w:t>
       </w:r>
     </w:p>
     <w:p>

</xml_diff>